<commit_message>
fix: Entidades, doc y pom. add: DNI tests
</commit_message>
<xml_diff>
--- a/docs/Documentacion.docx
+++ b/docs/Documentacion.docx
@@ -5,7 +5,13 @@
     <w:sdt>
       <w:sdtPr>
         <w:rPr>
+          <w:rFonts w:eastAsiaTheme="minorHAnsi"/>
           <w:color w:val="156082" w:themeColor="accent1"/>
+          <w:kern w:val="2"/>
+          <w:sz w:val="24"/>
+          <w:szCs w:val="24"/>
+          <w:lang w:eastAsia="en-US"/>
+          <w14:ligatures w14:val="standardContextual"/>
         </w:rPr>
         <w:id w:val="703060164"/>
         <w:docPartObj>
@@ -15,13 +21,7 @@
       </w:sdtPr>
       <w:sdtEndPr>
         <w:rPr>
-          <w:rFonts w:eastAsiaTheme="minorHAnsi"/>
           <w:color w:val="auto"/>
-          <w:kern w:val="2"/>
-          <w:sz w:val="24"/>
-          <w:szCs w:val="24"/>
-          <w:lang w:eastAsia="en-US"/>
-          <w14:ligatures w14:val="standardContextual"/>
         </w:rPr>
       </w:sdtEndPr>
       <w:sdtContent>
@@ -705,6 +705,15 @@
     </w:sdt>
     <w:sdt>
       <w:sdtPr>
+        <w:rPr>
+          <w:rFonts w:asciiTheme="minorHAnsi" w:eastAsiaTheme="minorHAnsi" w:hAnsiTheme="minorHAnsi" w:cstheme="minorBidi"/>
+          <w:color w:val="auto"/>
+          <w:kern w:val="2"/>
+          <w:sz w:val="24"/>
+          <w:szCs w:val="24"/>
+          <w:lang w:eastAsia="en-US"/>
+          <w14:ligatures w14:val="standardContextual"/>
+        </w:rPr>
         <w:id w:val="-846637350"/>
         <w:docPartObj>
           <w:docPartGallery w:val="Table of Contents"/>
@@ -713,15 +722,8 @@
       </w:sdtPr>
       <w:sdtEndPr>
         <w:rPr>
-          <w:rFonts w:asciiTheme="minorHAnsi" w:eastAsiaTheme="minorHAnsi" w:hAnsiTheme="minorHAnsi" w:cstheme="minorBidi"/>
           <w:b/>
           <w:bCs/>
-          <w:color w:val="auto"/>
-          <w:kern w:val="2"/>
-          <w:sz w:val="24"/>
-          <w:szCs w:val="24"/>
-          <w:lang w:eastAsia="en-US"/>
-          <w14:ligatures w14:val="standardContextual"/>
         </w:rPr>
       </w:sdtEndPr>
       <w:sdtContent>
@@ -734,30 +736,16 @@
           </w:r>
         </w:p>
         <w:p>
-          <w:r>
-            <w:fldChar w:fldCharType="begin"/>
-          </w:r>
-          <w:r>
-            <w:instrText xml:space="preserve"> TOC \o "1-3" \h \z \u </w:instrText>
-          </w:r>
-          <w:r>
-            <w:fldChar w:fldCharType="separate"/>
-          </w:r>
-          <w:r>
-            <w:rPr>
-              <w:b/>
-              <w:bCs/>
-              <w:noProof/>
-            </w:rPr>
-            <w:t>No se encontraron entradas de tabla de contenido.</w:t>
-          </w:r>
-          <w:r>
-            <w:rPr>
-              <w:b/>
-              <w:bCs/>
-            </w:rPr>
-            <w:fldChar w:fldCharType="end"/>
-          </w:r>
+          <w:fldSimple w:instr=" TOC \o &quot;1-3&quot; \h \z \u ">
+            <w:r>
+              <w:rPr>
+                <w:b/>
+                <w:bCs/>
+                <w:noProof/>
+              </w:rPr>
+              <w:t>No se encontraron entradas de tabla de contenido.</w:t>
+            </w:r>
+          </w:fldSimple>
         </w:p>
       </w:sdtContent>
     </w:sdt>
@@ -787,6 +775,9 @@
       <w:r>
         <w:t>Se han creado dos modelos que tratarán con al aplicación.</w:t>
       </w:r>
+      <w:r>
+        <w:t xml:space="preserve"> Mientras se realizaban las pruebas para ver si Hibernate creaba las tablas correctamente en la base de datos. Me he dado cuenta de que las tablas no pueden llamarse User y Order porque son palabras reservadas. Por lo que he tenido que añadir la anotación @Table y ponerles de nombre users y orders.</w:t>
+      </w:r>
     </w:p>
     <w:p>
       <w:pPr>
@@ -802,7 +793,49 @@
       </w:r>
       <w:r>
         <w:br/>
-        <w:t>La entidad se compone principalmente de una clave primaria (DNI), campos String/VARCHAR para nombre y apellidos y por último una clave foránea (orders) que tiene relación con la entidad Order. Nos permite guardar una lista de pedidos realizados por un mismo cliente.</w:t>
+        <w:t>La entidad se compone principalmente de una clave primaria (DNI), campos String/VARCHAR para nombre y apellidos y por último una clave foránea (orders) que tiene relación con la entidad Order. Nos permite guardar una lista de pedidos realizados por un mismo cliente</w:t>
+      </w:r>
+      <w:r>
+        <w:t>.</w:t>
+      </w:r>
+    </w:p>
+    <w:p>
+      <w:r>
+        <w:drawing>
+          <wp:inline distT="0" distB="0" distL="0" distR="0" wp14:anchorId="33BB1049" wp14:editId="57B7FDDD">
+            <wp:extent cx="2739948" cy="2057400"/>
+            <wp:effectExtent l="0" t="0" r="3810" b="0"/>
+            <wp:docPr id="1415001612" name="Imagen 1"/>
+            <wp:cNvGraphicFramePr>
+              <a:graphicFrameLocks xmlns:a="http://schemas.openxmlformats.org/drawingml/2006/main" noChangeAspect="1"/>
+            </wp:cNvGraphicFramePr>
+            <a:graphic xmlns:a="http://schemas.openxmlformats.org/drawingml/2006/main">
+              <a:graphicData uri="http://schemas.openxmlformats.org/drawingml/2006/picture">
+                <pic:pic xmlns:pic="http://schemas.openxmlformats.org/drawingml/2006/picture">
+                  <pic:nvPicPr>
+                    <pic:cNvPr id="1415001612" name=""/>
+                    <pic:cNvPicPr/>
+                  </pic:nvPicPr>
+                  <pic:blipFill>
+                    <a:blip r:embed="rId8"/>
+                    <a:stretch>
+                      <a:fillRect/>
+                    </a:stretch>
+                  </pic:blipFill>
+                  <pic:spPr>
+                    <a:xfrm>
+                      <a:off x="0" y="0"/>
+                      <a:ext cx="2756299" cy="2069678"/>
+                    </a:xfrm>
+                    <a:prstGeom prst="rect">
+                      <a:avLst/>
+                    </a:prstGeom>
+                  </pic:spPr>
+                </pic:pic>
+              </a:graphicData>
+            </a:graphic>
+          </wp:inline>
+        </w:drawing>
       </w:r>
     </w:p>
     <w:p>
@@ -822,7 +855,46 @@
         <w:t>La entidad se compone principalmente de una clave primaria (ID), campos de texto para el nombre y la descripción, campos de números flotantes para el peso y el precio y por último una clave foránea (user) que hace referencia al Usuario que ha realiza el pedido en concreto. Nos permite registrar a quien pertenece cada pedido.</w:t>
       </w:r>
     </w:p>
-    <w:p/>
+    <w:p>
+      <w:r>
+        <w:lastRenderedPageBreak/>
+        <w:drawing>
+          <wp:inline distT="0" distB="0" distL="0" distR="0" wp14:anchorId="1863AF88" wp14:editId="1A951620">
+            <wp:extent cx="2731591" cy="2407920"/>
+            <wp:effectExtent l="0" t="0" r="0" b="0"/>
+            <wp:docPr id="1681804652" name="Imagen 1"/>
+            <wp:cNvGraphicFramePr>
+              <a:graphicFrameLocks xmlns:a="http://schemas.openxmlformats.org/drawingml/2006/main" noChangeAspect="1"/>
+            </wp:cNvGraphicFramePr>
+            <a:graphic xmlns:a="http://schemas.openxmlformats.org/drawingml/2006/main">
+              <a:graphicData uri="http://schemas.openxmlformats.org/drawingml/2006/picture">
+                <pic:pic xmlns:pic="http://schemas.openxmlformats.org/drawingml/2006/picture">
+                  <pic:nvPicPr>
+                    <pic:cNvPr id="1681804652" name=""/>
+                    <pic:cNvPicPr/>
+                  </pic:nvPicPr>
+                  <pic:blipFill>
+                    <a:blip r:embed="rId9"/>
+                    <a:stretch>
+                      <a:fillRect/>
+                    </a:stretch>
+                  </pic:blipFill>
+                  <pic:spPr>
+                    <a:xfrm>
+                      <a:off x="0" y="0"/>
+                      <a:ext cx="2758191" cy="2431369"/>
+                    </a:xfrm>
+                    <a:prstGeom prst="rect">
+                      <a:avLst/>
+                    </a:prstGeom>
+                  </pic:spPr>
+                </pic:pic>
+              </a:graphicData>
+            </a:graphic>
+          </wp:inline>
+        </w:drawing>
+      </w:r>
+    </w:p>
     <w:p>
       <w:pPr>
         <w:pStyle w:val="Ttulo2"/>
@@ -881,6 +953,72 @@
       </w:pPr>
       <w:r>
         <w:t>Docker</w:t>
+      </w:r>
+    </w:p>
+    <w:p>
+      <w:pPr>
+        <w:pStyle w:val="Ttulo1"/>
+      </w:pPr>
+      <w:r>
+        <w:t>Pruebas</w:t>
+      </w:r>
+    </w:p>
+    <w:p>
+      <w:r>
+        <w:t xml:space="preserve">Para probar si las diferentes funcionalidades de la aplicación funcionan, se han llevado a cabo test unitarios. </w:t>
+      </w:r>
+    </w:p>
+    <w:p>
+      <w:pPr>
+        <w:pStyle w:val="Ttulo2"/>
+      </w:pPr>
+      <w:r>
+        <w:t>Validar DNI</w:t>
+      </w:r>
+    </w:p>
+    <w:p>
+      <w:r>
+        <w:t>Para comprobar que el validador de DNI funciona. Se ha creado una clase DNIValidatorTest en src/test/validation donde se realizan varias pruebas.</w:t>
+      </w:r>
+    </w:p>
+    <w:p>
+      <w:r>
+        <w:lastRenderedPageBreak/>
+        <w:drawing>
+          <wp:inline distT="0" distB="0" distL="0" distR="0" wp14:anchorId="1A5C22BC" wp14:editId="5BAD39D9">
+            <wp:extent cx="2796782" cy="2705334"/>
+            <wp:effectExtent l="0" t="0" r="3810" b="0"/>
+            <wp:docPr id="852714969" name="Imagen 1"/>
+            <wp:cNvGraphicFramePr>
+              <a:graphicFrameLocks xmlns:a="http://schemas.openxmlformats.org/drawingml/2006/main" noChangeAspect="1"/>
+            </wp:cNvGraphicFramePr>
+            <a:graphic xmlns:a="http://schemas.openxmlformats.org/drawingml/2006/main">
+              <a:graphicData uri="http://schemas.openxmlformats.org/drawingml/2006/picture">
+                <pic:pic xmlns:pic="http://schemas.openxmlformats.org/drawingml/2006/picture">
+                  <pic:nvPicPr>
+                    <pic:cNvPr id="852714969" name=""/>
+                    <pic:cNvPicPr/>
+                  </pic:nvPicPr>
+                  <pic:blipFill>
+                    <a:blip r:embed="rId10"/>
+                    <a:stretch>
+                      <a:fillRect/>
+                    </a:stretch>
+                  </pic:blipFill>
+                  <pic:spPr>
+                    <a:xfrm>
+                      <a:off x="0" y="0"/>
+                      <a:ext cx="2796782" cy="2705334"/>
+                    </a:xfrm>
+                    <a:prstGeom prst="rect">
+                      <a:avLst/>
+                    </a:prstGeom>
+                  </pic:spPr>
+                </pic:pic>
+              </a:graphicData>
+            </a:graphic>
+          </wp:inline>
+        </w:drawing>
       </w:r>
     </w:p>
     <w:p/>
@@ -1977,7 +2115,10 @@
   </w:compat>
   <w:rsids>
     <w:rsidRoot w:val="002E23B8"/>
+    <w:rsid w:val="000F787C"/>
+    <w:rsid w:val="002744CB"/>
     <w:rsid w:val="002E23B8"/>
+    <w:rsid w:val="005B03EE"/>
     <w:rsid w:val="005C75DC"/>
     <w:rsid w:val="00E0030B"/>
   </w:rsids>
@@ -2438,18 +2579,6 @@
     <w:name w:val="32C6550393D54CC2B5E2FEBD3B269624"/>
     <w:rsid w:val="002E23B8"/>
   </w:style>
-  <w:style w:type="paragraph" w:customStyle="1" w:styleId="309DCC2E32FA416CA427E13A7E07DC85">
-    <w:name w:val="309DCC2E32FA416CA427E13A7E07DC85"/>
-    <w:rsid w:val="002E23B8"/>
-  </w:style>
-  <w:style w:type="paragraph" w:customStyle="1" w:styleId="4D99BA5670DD4E01B35FE55D03034FC8">
-    <w:name w:val="4D99BA5670DD4E01B35FE55D03034FC8"/>
-    <w:rsid w:val="002E23B8"/>
-  </w:style>
-  <w:style w:type="paragraph" w:customStyle="1" w:styleId="DC89B82C7AE544838487ABF8E4897A6C">
-    <w:name w:val="DC89B82C7AE544838487ABF8E4897A6C"/>
-    <w:rsid w:val="002E23B8"/>
-  </w:style>
 </w:styles>
 </file>
 

</xml_diff>